<commit_message>
Expand academic projects and feature buffer overflow and network security
</commit_message>
<xml_diff>
--- a/resume/Duy_Linh_Hoang_Resume.docx
+++ b/resume/Duy_Linh_Hoang_Resume.docx
@@ -2261,6 +2261,7 @@
           <w:bCs w:val="0"/>
           <w:color w:val="000000" w:themeColor="text1"/>
         </w:rPr>
+        <w:ind w:right="562"/>
       </w:pPr>
       <w:r>
         <w:rPr>
@@ -2269,7 +2270,7 @@
           <w:bCs w:val="0"/>
           <w:color w:val="000000" w:themeColor="text1"/>
         </w:rPr>
-        <w:t xml:space="preserve">Built course search, enrollment, and withdrawal workflows using parameterized SQL and a composite key; delivered an application and schema connecting database structure to consistent student record management.</w:t>
+        <w:t xml:space="preserve">Designed student, course, and enrollment tables and built search, enrollment, withdrawal, and record-management workflows. Used parameterized SQL and a composite enrollment key to structure data access and relationships; delivered application code, a database, and schema documentation demonstrating how the data model supports consistent student record management.</w:t>
       </w:r>
     </w:p>
     <w:p>
@@ -2284,7 +2285,7 @@
         <w:rPr>
           <w:color w:val="005F75"/>
         </w:rPr>
-        <w:t xml:space="preserve">STATISTICAL SUMMARIES AND REGRESSION ~ StatCrunch</w:t>
+        <w:t xml:space="preserve">STUDYING BUFFER OVERFLOW ~ Stack Memory | ASLR | Exploit Analysis</w:t>
       </w:r>
     </w:p>
     <w:p>
@@ -2300,6 +2301,7 @@
           <w:bCs w:val="0"/>
           <w:color w:val="000000" w:themeColor="text1"/>
         </w:rPr>
+        <w:ind w:right="562"/>
       </w:pPr>
       <w:r>
         <w:rPr>
@@ -2308,7 +2310,7 @@
           <w:bCs w:val="0"/>
           <w:color w:val="000000" w:themeColor="text1"/>
         </w:rPr>
-        <w:t xml:space="preserve">Analyzed distributions, regression models, and residuals to assess relationships; documented weak predictive results and model limitations to distinguish observed associations from dependable predictions.</w:t>
+        <w:t xml:space="preserve">Analyzed stack layouts and unsafe memory copying, examined ASLR and other memory protections, and documented an exploit exercise in a controlled lab. Connected overflow behavior to stack contents to explain vulnerability mechanisms; produced a report and exploit source recording parameters and observed behavior.</w:t>
       </w:r>
     </w:p>
     <w:p>
@@ -2323,7 +2325,7 @@
         <w:rPr>
           <w:color w:val="005F75"/>
         </w:rPr>
-        <w:t xml:space="preserve">LINUX ACCESS CONTROLS AND NETWORK SECURITY ~ Linux | Docker | Scapy | iptables</w:t>
+        <w:t xml:space="preserve">EXPLORING PACKET SPOOFING AND FIREWALLS ~ Docker | Scapy | iptables</w:t>
       </w:r>
     </w:p>
     <w:p>
@@ -2339,6 +2341,7 @@
           <w:bCs w:val="0"/>
           <w:color w:val="000000" w:themeColor="text1"/>
         </w:rPr>
+        <w:ind w:right="562"/>
       </w:pPr>
       <w:r>
         <w:rPr>
@@ -2347,7 +2350,7 @@
           <w:bCs w:val="0"/>
           <w:color w:val="000000" w:themeColor="text1"/>
         </w:rPr>
-        <w:t xml:space="preserve">Tested permissions, ACLs, packet spoofing, and firewall behavior in controlled labs; documented observed access and filtering outcomes to explain least privilege and the limits of security controls.</w:t>
+        <w:t xml:space="preserve">Configured a container network, captured and generated packets, and tested stateless and stateful firewall rules, connection tracking, traffic limits, and load balancing. Compared how rule placement and connection state affect communication; produced a report with setup evidence, command explanations, and observed filtering behavior.</w:t>
       </w:r>
     </w:p>
     <w:p>
@@ -2362,7 +2365,7 @@
         <w:rPr>
           <w:color w:val="005F75"/>
         </w:rPr>
-        <w:t xml:space="preserve">SPECTROPHOTOMETRIC CALIBRATION ~ UV-Vis | Excel</w:t>
+        <w:t xml:space="preserve">LINUX ACCESS CONTROLS ~ Linux Permissions | Access Lists</w:t>
       </w:r>
     </w:p>
     <w:p>
@@ -2378,6 +2381,7 @@
           <w:bCs w:val="0"/>
           <w:color w:val="000000" w:themeColor="text1"/>
         </w:rPr>
+        <w:ind w:right="562"/>
       </w:pPr>
       <w:r>
         <w:rPr>
@@ -2386,7 +2390,47 @@
           <w:bCs w:val="0"/>
           <w:color w:val="000000" w:themeColor="text1"/>
         </w:rPr>
-        <w:t xml:space="preserve">Prepared standards, measured absorbance at 420 nm, and compared calibration methods to estimate concentration; produced a report and workbook examining differing results, uncertainty, and possible matrix effects.</w:t>
+        <w:t xml:space="preserve">Translated an access-control scenario into an access matrix, access lists, and Linux ownership and permission commands. Mapped each process to the access needed for its task to apply least privilege; produced a lab report documenting permission reasoning, configuration steps, and verification evidence.</w:t>
+      </w:r>
+    </w:p>
+    <w:p>
+      <w:pPr>
+        <w:pStyle w:val="Heading2"/>
+        <w:ind w:left="288" w:right="562"/>
+        <w:rPr>
+          <w:color w:val="005F75"/>
+        </w:rPr>
+      </w:pPr>
+      <w:r>
+        <w:rPr>
+          <w:color w:val="005F75"/>
+        </w:rPr>
+        <w:t xml:space="preserve">SPECTROPHOTOMETRIC CALIBRATION ~ UV-Vis | Excel</w:t>
+      </w:r>
+    </w:p>
+    <w:p>
+      <w:pPr>
+        <w:pStyle w:val="Heading2"/>
+        <w:numPr>
+          <w:ilvl w:val="0"/>
+          <w:numId w:val="2"/>
+        </w:numPr>
+        <w:rPr>
+          <w:rFonts w:ascii="Arial" w:hAnsi="Arial" w:cs="Arial"/>
+          <w:b w:val="0"/>
+          <w:bCs w:val="0"/>
+          <w:color w:val="000000" w:themeColor="text1"/>
+        </w:rPr>
+        <w:ind w:right="562"/>
+      </w:pPr>
+      <w:r>
+        <w:rPr>
+          <w:rFonts w:ascii="Arial" w:hAnsi="Arial" w:cs="Arial"/>
+          <w:b w:val="0"/>
+          <w:bCs w:val="0"/>
+          <w:color w:val="000000" w:themeColor="text1"/>
+        </w:rPr>
+        <w:t xml:space="preserve">Prepared calibration standards and measured blank, sample, and replicate absorbance at 420 nm. Compared external calibration with standard addition using Excel regression to estimate concentration; delivered a report and calculation workbook documenting uncertainty, detection limits, differing estimates, and possible matrix effects that influence measurement interpretation.</w:t>
       </w:r>
     </w:p>
     <w:p>
@@ -2999,6 +3043,39 @@
           <w:color w:val="000000" w:themeColor="text1"/>
         </w:rPr>
         <w:t xml:space="preserve">Tracked comps, voids, discounts, and refunds to identify transaction patterns and support oversight of revenue and payment controls.</w:t>
+      </w:r>
+    </w:p>
+    <w:p>
+      <w:pPr>
+        <w:pStyle w:val="Heading2"/>
+        <w:ind w:left="288"/>
+        <w:rPr>
+          <w:color w:val="005F75"/>
+        </w:rPr>
+      </w:pPr>
+    </w:p>
+    <w:p>
+      <w:pPr>
+        <w:tabs>
+          <w:tab w:val="left" w:pos="845"/>
+        </w:tabs>
+        <w:spacing w:before="1"/>
+        <w:ind w:left="360"/>
+        <w:rPr>
+          <w:rFonts w:ascii="Arial" w:hAnsi="Arial" w:cs="Arial"/>
+          <w:sz w:val="20"/>
+          <w:szCs w:val="24"/>
+        </w:rPr>
+      </w:pPr>
+      <w:r>
+        <w:rPr>
+          <w:rFonts w:ascii="Arial" w:hAnsi="Arial" w:cs="Arial"/>
+          <w:sz w:val="20"/>
+          <w:szCs w:val="24"/>
+          <w:b w:val="0"/>
+          <w:bCs w:val="0"/>
+        </w:rPr>
+        <w:t xml:space="preserve">References available upon request.</w:t>
       </w:r>
     </w:p>
     <w:sectPr>

</xml_diff>

<commit_message>
Keep expanded academic projects and references on one page
</commit_message>
<xml_diff>
--- a/resume/Duy_Linh_Hoang_Resume.docx
+++ b/resume/Duy_Linh_Hoang_Resume.docx
@@ -2270,7 +2270,7 @@
           <w:bCs w:val="0"/>
           <w:color w:val="000000" w:themeColor="text1"/>
         </w:rPr>
-        <w:t xml:space="preserve">Designed student, course, and enrollment tables and built search, enrollment, withdrawal, and record-management workflows. Used parameterized SQL and a composite enrollment key to structure data access and relationships; delivered application code, a database, and schema documentation demonstrating how the data model supports consistent student record management.</w:t>
+        <w:t xml:space="preserve">Designed student, course, and enrollment tables and implemented search, enrollment, withdrawal, and record management. Used parameterized SQL and a composite enrollment key to structure data relationships; delivered code, a database, and schema documentation demonstrating consistent student record workflows.</w:t>
       </w:r>
     </w:p>
     <w:p>
@@ -2310,7 +2310,7 @@
           <w:bCs w:val="0"/>
           <w:color w:val="000000" w:themeColor="text1"/>
         </w:rPr>
-        <w:t xml:space="preserve">Analyzed stack layouts and unsafe memory copying, examined ASLR and other memory protections, and documented an exploit exercise in a controlled lab. Connected overflow behavior to stack contents to explain vulnerability mechanisms; produced a report and exploit source recording parameters and observed behavior.</w:t>
+        <w:t xml:space="preserve">Analyzed stack layouts, unsafe memory copying, ASLR, and memory protections during a controlled exploit exercise. Connected overflow behavior to stack contents to explain vulnerability mechanisms; produced a lab report and exploit source documenting parameters and observed behavior.</w:t>
       </w:r>
     </w:p>
     <w:p>
@@ -2350,7 +2350,7 @@
           <w:bCs w:val="0"/>
           <w:color w:val="000000" w:themeColor="text1"/>
         </w:rPr>
-        <w:t xml:space="preserve">Configured a container network, captured and generated packets, and tested stateless and stateful firewall rules, connection tracking, traffic limits, and load balancing. Compared how rule placement and connection state affect communication; produced a report with setup evidence, command explanations, and observed filtering behavior.</w:t>
+        <w:t xml:space="preserve">Configured a container network, captured and generated packets, and tested stateful and stateless rules, connection tracking, traffic limits, and load balancing. Compared how rule placement and connection state affect communication; documented setup, commands, and observed filtering behavior in a report.</w:t>
       </w:r>
     </w:p>
     <w:p>
@@ -2390,7 +2390,7 @@
           <w:bCs w:val="0"/>
           <w:color w:val="000000" w:themeColor="text1"/>
         </w:rPr>
-        <w:t xml:space="preserve">Translated an access-control scenario into an access matrix, access lists, and Linux ownership and permission commands. Mapped each process to the access needed for its task to apply least privilege; produced a lab report documenting permission reasoning, configuration steps, and verification evidence.</w:t>
+        <w:t xml:space="preserve">Mapped an access-control scenario to an access matrix, access lists, and Linux ownership and permissions. Assigned processes the access required for their tasks to apply least privilege; documented permission reasoning, configuration commands, and verification evidence in a lab report.</w:t>
       </w:r>
     </w:p>
     <w:p>
@@ -2430,7 +2430,7 @@
           <w:bCs w:val="0"/>
           <w:color w:val="000000" w:themeColor="text1"/>
         </w:rPr>
-        <w:t xml:space="preserve">Prepared calibration standards and measured blank, sample, and replicate absorbance at 420 nm. Compared external calibration with standard addition using Excel regression to estimate concentration; delivered a report and calculation workbook documenting uncertainty, detection limits, differing estimates, and possible matrix effects that influence measurement interpretation.</w:t>
+        <w:t xml:space="preserve">Prepared standards and measured blank, sample, and replicate absorbance at 420 nm. Used Excel regression to compare external calibration and standard addition for concentration estimates; produced a report and workbook examining uncertainty, detection limits, differing results, and possible matrix effects.</w:t>
       </w:r>
     </w:p>
     <w:p>
@@ -3044,15 +3044,6 @@
         </w:rPr>
         <w:t xml:space="preserve">Tracked comps, voids, discounts, and refunds to identify transaction patterns and support oversight of revenue and payment controls.</w:t>
       </w:r>
-    </w:p>
-    <w:p>
-      <w:pPr>
-        <w:pStyle w:val="Heading2"/>
-        <w:ind w:left="288"/>
-        <w:rPr>
-          <w:color w:val="005F75"/>
-        </w:rPr>
-      </w:pPr>
     </w:p>
     <w:p>
       <w:pPr>

</xml_diff>

<commit_message>
Simplify resume contacts and restore professional references
</commit_message>
<xml_diff>
--- a/resume/Duy_Linh_Hoang_Resume.docx
+++ b/resume/Duy_Linh_Hoang_Resume.docx
@@ -533,15 +533,6 @@
                                 <w:rPr>
                                   <w:rFonts w:ascii="Calibri"/>
                                   <w:sz w:val="18"/>
-                                  <w:b w:val="1"/>
-                                  <w:bCs w:val="1"/>
-                                </w:rPr>
-                                <w:t xml:space="preserve">Mobile: </w:t>
-                              </w:r>
-                              <w:r>
-                                <w:rPr>
-                                  <w:rFonts w:ascii="Calibri"/>
-                                  <w:sz w:val="18"/>
                                   <w:b w:val="0"/>
                                   <w:bCs w:val="0"/>
                                 </w:rPr>
@@ -557,15 +548,6 @@
                                   <w:sz w:val="18"/>
                                 </w:rPr>
                               </w:pPr>
-                              <w:r>
-                                <w:rPr>
-                                  <w:rFonts w:ascii="Calibri"/>
-                                  <w:sz w:val="18"/>
-                                  <w:b w:val="1"/>
-                                  <w:bCs w:val="1"/>
-                                </w:rPr>
-                                <w:t xml:space="preserve">Residence: </w:t>
-                              </w:r>
                               <w:r>
                                 <w:rPr>
                                   <w:rFonts w:ascii="Calibri"/>
@@ -587,15 +569,6 @@
                                   <w:sz w:val="18"/>
                                 </w:rPr>
                               </w:pPr>
-                              <w:r>
-                                <w:rPr>
-                                  <w:rFonts w:ascii="Calibri"/>
-                                  <w:sz w:val="18"/>
-                                  <w:b w:val="1"/>
-                                  <w:bCs w:val="1"/>
-                                </w:rPr>
-                                <w:t xml:space="preserve">E-mail: </w:t>
-                              </w:r>
                               <w:hyperlink r:id="rIdDuyEmail">
                                 <w:r>
                                   <w:rPr>
@@ -625,23 +598,11 @@
                                   <w:rFonts w:ascii="Calibri"/>
                                   <w:spacing w:val="-2"/>
                                   <w:sz w:val="18"/>
-                                  <w:b w:val="1"/>
-                                  <w:bCs w:val="1"/>
+                                  <w:b w:val="0"/>
+                                  <w:bCs w:val="0"/>
                                 </w:rPr>
-                                <w:t xml:space="preserve">Portfolio: </w:t>
+                                <w:t xml:space="preserve"/>
                               </w:r>
-                              <w:hyperlink r:id="rIdDuyPortfolio">
-                                <w:r>
-                                  <w:rPr>
-                                    <w:rFonts w:ascii="Calibri"/>
-                                    <w:spacing w:val="-2"/>
-                                    <w:sz w:val="18"/>
-                                    <w:b w:val="0"/>
-                                    <w:bCs w:val="0"/>
-                                  </w:rPr>
-                                  <w:t xml:space="preserve">Academic projects</w:t>
-                                </w:r>
-                              </w:hyperlink>
                             </w:p>
                           </w:txbxContent>
                         </wps:txbx>
@@ -799,15 +760,6 @@
                           <w:rPr>
                             <w:rFonts w:ascii="Calibri"/>
                             <w:sz w:val="18"/>
-                            <w:b w:val="1"/>
-                            <w:bCs w:val="1"/>
-                          </w:rPr>
-                          <w:t xml:space="preserve">Mobile: </w:t>
-                        </w:r>
-                        <w:r>
-                          <w:rPr>
-                            <w:rFonts w:ascii="Calibri"/>
-                            <w:sz w:val="18"/>
                             <w:b w:val="0"/>
                             <w:bCs w:val="0"/>
                           </w:rPr>
@@ -823,15 +775,6 @@
                             <w:sz w:val="18"/>
                           </w:rPr>
                         </w:pPr>
-                        <w:r>
-                          <w:rPr>
-                            <w:rFonts w:ascii="Calibri"/>
-                            <w:sz w:val="18"/>
-                            <w:b w:val="1"/>
-                            <w:bCs w:val="1"/>
-                          </w:rPr>
-                          <w:t xml:space="preserve">Residence: </w:t>
-                        </w:r>
                         <w:r>
                           <w:rPr>
                             <w:rFonts w:ascii="Calibri"/>
@@ -853,15 +796,6 @@
                             <w:sz w:val="18"/>
                           </w:rPr>
                         </w:pPr>
-                        <w:r>
-                          <w:rPr>
-                            <w:rFonts w:ascii="Calibri"/>
-                            <w:sz w:val="18"/>
-                            <w:b w:val="1"/>
-                            <w:bCs w:val="1"/>
-                          </w:rPr>
-                          <w:t xml:space="preserve">E-mail: </w:t>
-                        </w:r>
                         <w:hyperlink r:id="rIdDuyEmail">
                           <w:r>
                             <w:rPr>
@@ -891,23 +825,11 @@
                             <w:rFonts w:ascii="Calibri"/>
                             <w:spacing w:val="-2"/>
                             <w:sz w:val="18"/>
-                            <w:b w:val="1"/>
-                            <w:bCs w:val="1"/>
+                            <w:b w:val="0"/>
+                            <w:bCs w:val="0"/>
                           </w:rPr>
-                          <w:t xml:space="preserve">Portfolio: </w:t>
+                          <w:t xml:space="preserve"/>
                         </w:r>
-                        <w:hyperlink r:id="rIdDuyPortfolio">
-                          <w:r>
-                            <w:rPr>
-                              <w:rFonts w:ascii="Calibri"/>
-                              <w:spacing w:val="-2"/>
-                              <w:sz w:val="18"/>
-                              <w:b w:val="0"/>
-                              <w:bCs w:val="0"/>
-                            </w:rPr>
-                            <w:t xml:space="preserve">Academic projects</w:t>
-                          </w:r>
-                        </w:hyperlink>
                       </w:p>
                     </w:txbxContent>
                   </v:textbox>
@@ -2227,19 +2149,11 @@
     <w:p>
       <w:pPr>
         <w:pStyle w:val="Heading2"/>
-        <w:ind w:left="0"/>
+        <w:ind w:left="288" w:right="562"/>
         <w:rPr>
           <w:color w:val="005F75"/>
         </w:rPr>
-      </w:pPr>
-    </w:p>
-    <w:p>
-      <w:pPr>
-        <w:pStyle w:val="Heading2"/>
-        <w:ind w:left="288" w:right="562"/>
-        <w:rPr>
-          <w:color w:val="005F75"/>
-        </w:rPr>
+        <w:spacing w:before="80"/>
       </w:pPr>
       <w:r>
         <w:rPr>
@@ -2854,19 +2768,11 @@
     <w:p>
       <w:pPr>
         <w:pStyle w:val="Heading2"/>
-        <w:ind w:left="0"/>
+        <w:ind w:left="288"/>
         <w:rPr>
           <w:color w:val="005F75"/>
         </w:rPr>
-      </w:pPr>
-    </w:p>
-    <w:p>
-      <w:pPr>
-        <w:pStyle w:val="Heading2"/>
-        <w:ind w:left="288"/>
-        <w:rPr>
-          <w:color w:val="005F75"/>
-        </w:rPr>
+        <w:spacing w:before="80"/>
       </w:pPr>
       <w:r>
         <w:rPr>
@@ -3063,10 +2969,82 @@
           <w:rFonts w:ascii="Arial" w:hAnsi="Arial" w:cs="Arial"/>
           <w:sz w:val="20"/>
           <w:szCs w:val="24"/>
+          <w:b w:val="1"/>
+          <w:bCs w:val="1"/>
+        </w:rPr>
+        <w:t xml:space="preserve">REFERENCES</w:t>
+      </w:r>
+    </w:p>
+    <w:p>
+      <w:pPr>
+        <w:tabs>
+          <w:tab w:val="left" w:pos="845"/>
+        </w:tabs>
+        <w:spacing w:before="1"/>
+        <w:ind w:left="360"/>
+        <w:rPr>
+          <w:rFonts w:ascii="Arial" w:hAnsi="Arial" w:cs="Arial"/>
+          <w:sz w:val="20"/>
+          <w:szCs w:val="24"/>
+        </w:rPr>
+      </w:pPr>
+      <w:r>
+        <w:rPr>
+          <w:rFonts w:ascii="Arial" w:hAnsi="Arial" w:cs="Arial"/>
+          <w:sz w:val="20"/>
+          <w:szCs w:val="24"/>
           <w:b w:val="0"/>
           <w:bCs w:val="0"/>
         </w:rPr>
-        <w:t xml:space="preserve">References available upon request.</w:t>
+        <w:t xml:space="preserve">Mounir Guirguis | Restaurant Owner and Mentor, Stelton Pizza | (732) 261-2829</w:t>
+      </w:r>
+    </w:p>
+    <w:p>
+      <w:pPr>
+        <w:tabs>
+          <w:tab w:val="left" w:pos="845"/>
+        </w:tabs>
+        <w:spacing w:before="1"/>
+        <w:ind w:left="360"/>
+        <w:rPr>
+          <w:rFonts w:ascii="Arial" w:hAnsi="Arial" w:cs="Arial"/>
+          <w:sz w:val="20"/>
+          <w:szCs w:val="24"/>
+        </w:rPr>
+      </w:pPr>
+      <w:r>
+        <w:rPr>
+          <w:rFonts w:ascii="Arial" w:hAnsi="Arial" w:cs="Arial"/>
+          <w:sz w:val="20"/>
+          <w:szCs w:val="24"/>
+          <w:b w:val="0"/>
+          <w:bCs w:val="0"/>
+        </w:rPr>
+        <w:t xml:space="preserve">Edson Saavedra | Manager, Rosa Mexicano | (908) 307-0312</w:t>
+      </w:r>
+    </w:p>
+    <w:p>
+      <w:pPr>
+        <w:tabs>
+          <w:tab w:val="left" w:pos="845"/>
+        </w:tabs>
+        <w:spacing w:before="1"/>
+        <w:ind w:left="360"/>
+        <w:rPr>
+          <w:rFonts w:ascii="Arial" w:hAnsi="Arial" w:cs="Arial"/>
+          <w:sz w:val="20"/>
+          <w:szCs w:val="24"/>
+        </w:rPr>
+      </w:pPr>
+      <w:r>
+        <w:rPr>
+          <w:rFonts w:ascii="Arial" w:hAnsi="Arial" w:cs="Arial"/>
+          <w:sz w:val="20"/>
+          <w:szCs w:val="24"/>
+          <w:b w:val="0"/>
+          <w:bCs w:val="0"/>
+        </w:rPr>
+        <w:t xml:space="preserve">Sophia Chigar | Assistant Manager, Madison Modern Social | (646) 385-9094</w:t>
       </w:r>
     </w:p>
     <w:sectPr>

</xml_diff>

<commit_message>
Match reference styling and update Sophia Janicke contact details
</commit_message>
<xml_diff>
--- a/resume/Duy_Linh_Hoang_Resume.docx
+++ b/resume/Duy_Linh_Hoang_Resume.docx
@@ -2948,103 +2948,457 @@
           <w:bCs w:val="0"/>
           <w:color w:val="000000" w:themeColor="text1"/>
         </w:rPr>
-        <w:t xml:space="preserve">Tracked comps, voids, discounts, and refunds to identify transaction patterns and support oversight of revenue and payment controls.</w:t>
+        <w:t xml:space="preserve">Reviewed comps, voids, discounts, and refunds to identify transaction patterns and support revenue controls.</w:t>
       </w:r>
     </w:p>
     <w:p>
       <w:pPr>
-        <w:tabs>
-          <w:tab w:val="left" w:pos="845"/>
-        </w:tabs>
-        <w:spacing w:before="1"/>
-        <w:ind w:left="360"/>
-        <w:rPr>
-          <w:rFonts w:ascii="Arial" w:hAnsi="Arial" w:cs="Arial"/>
-          <w:sz w:val="20"/>
-          <w:szCs w:val="24"/>
-        </w:rPr>
-      </w:pPr>
-      <w:r>
-        <w:rPr>
-          <w:rFonts w:ascii="Arial" w:hAnsi="Arial" w:cs="Arial"/>
-          <w:sz w:val="20"/>
-          <w:szCs w:val="24"/>
-          <w:b w:val="1"/>
-          <w:bCs w:val="1"/>
-        </w:rPr>
-        <w:t xml:space="preserve">REFERENCES</w:t>
-      </w:r>
+        <w:pStyle w:val="Heading2"/>
+        <w:ind w:left="288"/>
+        <w:rPr>
+          <w:color w:val="005F75"/>
+        </w:rPr>
+      </w:pPr>
     </w:p>
     <w:p>
       <w:pPr>
-        <w:tabs>
-          <w:tab w:val="left" w:pos="845"/>
-        </w:tabs>
-        <w:spacing w:before="1"/>
-        <w:ind w:left="360"/>
-        <w:rPr>
-          <w:rFonts w:ascii="Arial" w:hAnsi="Arial" w:cs="Arial"/>
-          <w:sz w:val="20"/>
-          <w:szCs w:val="24"/>
-        </w:rPr>
-      </w:pPr>
-      <w:r>
-        <w:rPr>
-          <w:rFonts w:ascii="Arial" w:hAnsi="Arial" w:cs="Arial"/>
-          <w:sz w:val="20"/>
-          <w:szCs w:val="24"/>
-          <w:b w:val="0"/>
-          <w:bCs w:val="0"/>
-        </w:rPr>
-        <w:t xml:space="preserve">Mounir Guirguis | Restaurant Owner and Mentor, Stelton Pizza | (732) 261-2829</w:t>
+        <w:pStyle w:val="Heading1"/>
+      </w:pPr>
+      <w:r>
+        <w:rPr>
+          <w:noProof/>
+        </w:rPr>
+        <mc:AlternateContent>
+          <mc:Choice Requires="wpg">
+            <w:drawing>
+              <wp:anchor distT="0" distB="0" distL="114300" distR="114300" simplePos="0" relativeHeight="487596032" behindDoc="1" locked="0" layoutInCell="1" allowOverlap="1" wp14:anchorId="14995963" wp14:editId="5A06EC14">
+                <wp:simplePos x="0" y="0"/>
+                <wp:positionH relativeFrom="page">
+                  <wp:posOffset>-6350</wp:posOffset>
+                </wp:positionH>
+                <wp:positionV relativeFrom="paragraph">
+                  <wp:posOffset>-57150</wp:posOffset>
+                </wp:positionV>
+                <wp:extent cx="7778750" cy="353695"/>
+                <wp:effectExtent l="0" t="0" r="0" b="0"/>
+                <wp:wrapNone/>
+                <wp:docPr id="982093561" name="docshapegroup20"/>
+                <wp:cNvGraphicFramePr>
+                  <a:graphicFrameLocks xmlns:a="http://schemas.openxmlformats.org/drawingml/2006/main"/>
+                </wp:cNvGraphicFramePr>
+                <a:graphic xmlns:a="http://schemas.openxmlformats.org/drawingml/2006/main">
+                  <a:graphicData uri="http://schemas.microsoft.com/office/word/2010/wordprocessingGroup">
+                    <wpg:wgp>
+                      <wpg:cNvGrpSpPr>
+                        <a:grpSpLocks/>
+                      </wpg:cNvGrpSpPr>
+                      <wpg:grpSpPr bwMode="auto">
+                        <a:xfrm>
+                          <a:off x="0" y="0"/>
+                          <a:ext cx="7778750" cy="353695"/>
+                          <a:chOff x="-10" y="-90"/>
+                          <a:chExt cx="12250" cy="557"/>
+                        </a:xfrm>
+                      </wpg:grpSpPr>
+                      <pic:pic xmlns:pic="http://schemas.openxmlformats.org/drawingml/2006/picture">
+                        <pic:nvPicPr>
+                          <pic:cNvPr id="1702171686" name="docshape21"/>
+                          <pic:cNvPicPr>
+                            <a:picLocks noChangeAspect="1" noChangeArrowheads="1"/>
+                          </pic:cNvPicPr>
+                        </pic:nvPicPr>
+                        <pic:blipFill>
+                          <a:blip r:embed="rId17">
+                            <a:extLst>
+                              <a:ext uri="{28A0092B-C50C-407E-A947-70E740481C1C}">
+                                <a14:useLocalDpi xmlns:a14="http://schemas.microsoft.com/office/drawing/2010/main" val="0"/>
+                              </a:ext>
+                            </a:extLst>
+                          </a:blip>
+                          <a:srcRect/>
+                          <a:stretch>
+                            <a:fillRect/>
+                          </a:stretch>
+                        </pic:blipFill>
+                        <pic:spPr bwMode="auto">
+                          <a:xfrm>
+                            <a:off x="3561" y="-67"/>
+                            <a:ext cx="8679" cy="477"/>
+                          </a:xfrm>
+                          <a:prstGeom prst="rect">
+                            <a:avLst/>
+                          </a:prstGeom>
+                          <a:noFill/>
+                          <a:extLst>
+                            <a:ext uri="{909E8E84-426E-40DD-AFC4-6F175D3DCCD1}">
+                              <a14:hiddenFill xmlns:a14="http://schemas.microsoft.com/office/drawing/2010/main">
+                                <a:solidFill>
+                                  <a:srgbClr val="FFFFFF"/>
+                                </a:solidFill>
+                              </a14:hiddenFill>
+                            </a:ext>
+                          </a:extLst>
+                        </pic:spPr>
+                      </pic:pic>
+                      <pic:pic xmlns:pic="http://schemas.openxmlformats.org/drawingml/2006/picture">
+                        <pic:nvPicPr>
+                          <pic:cNvPr id="717575447" name="docshape22"/>
+                          <pic:cNvPicPr>
+                            <a:picLocks noChangeAspect="1" noChangeArrowheads="1"/>
+                          </pic:cNvPicPr>
+                        </pic:nvPicPr>
+                        <pic:blipFill>
+                          <a:blip r:embed="rId23">
+                            <a:extLst>
+                              <a:ext uri="{28A0092B-C50C-407E-A947-70E740481C1C}">
+                                <a14:useLocalDpi xmlns:a14="http://schemas.microsoft.com/office/drawing/2010/main" val="0"/>
+                              </a:ext>
+                            </a:extLst>
+                          </a:blip>
+                          <a:srcRect/>
+                          <a:stretch>
+                            <a:fillRect/>
+                          </a:stretch>
+                        </pic:blipFill>
+                        <pic:spPr bwMode="auto">
+                          <a:xfrm>
+                            <a:off x="3575" y="-38"/>
+                            <a:ext cx="8665" cy="343"/>
+                          </a:xfrm>
+                          <a:prstGeom prst="rect">
+                            <a:avLst/>
+                          </a:prstGeom>
+                          <a:noFill/>
+                          <a:extLst>
+                            <a:ext uri="{909E8E84-426E-40DD-AFC4-6F175D3DCCD1}">
+                              <a14:hiddenFill xmlns:a14="http://schemas.microsoft.com/office/drawing/2010/main">
+                                <a:solidFill>
+                                  <a:srgbClr val="FFFFFF"/>
+                                </a:solidFill>
+                              </a14:hiddenFill>
+                            </a:ext>
+                          </a:extLst>
+                        </pic:spPr>
+                      </pic:pic>
+                      <pic:pic xmlns:pic="http://schemas.openxmlformats.org/drawingml/2006/picture">
+                        <pic:nvPicPr>
+                          <pic:cNvPr id="33485034" name="docshape23"/>
+                          <pic:cNvPicPr>
+                            <a:picLocks noChangeAspect="1" noChangeArrowheads="1"/>
+                          </pic:cNvPicPr>
+                        </pic:nvPicPr>
+                        <pic:blipFill>
+                          <a:blip r:embed="rId24">
+                            <a:extLst>
+                              <a:ext uri="{28A0092B-C50C-407E-A947-70E740481C1C}">
+                                <a14:useLocalDpi xmlns:a14="http://schemas.microsoft.com/office/drawing/2010/main" val="0"/>
+                              </a:ext>
+                            </a:extLst>
+                          </a:blip>
+                          <a:srcRect/>
+                          <a:stretch>
+                            <a:fillRect/>
+                          </a:stretch>
+                        </pic:blipFill>
+                        <pic:spPr bwMode="auto">
+                          <a:xfrm>
+                            <a:off x="0" y="-90"/>
+                            <a:ext cx="5628" cy="557"/>
+                          </a:xfrm>
+                          <a:prstGeom prst="rect">
+                            <a:avLst/>
+                          </a:prstGeom>
+                          <a:noFill/>
+                          <a:extLst>
+                            <a:ext uri="{909E8E84-426E-40DD-AFC4-6F175D3DCCD1}">
+                              <a14:hiddenFill xmlns:a14="http://schemas.microsoft.com/office/drawing/2010/main">
+                                <a:solidFill>
+                                  <a:srgbClr val="FFFFFF"/>
+                                </a:solidFill>
+                              </a14:hiddenFill>
+                            </a:ext>
+                          </a:extLst>
+                        </pic:spPr>
+                      </pic:pic>
+                      <wps:wsp>
+                        <wps:cNvPr id="80822145" name="docshape24"/>
+                        <wps:cNvSpPr>
+                          <a:spLocks/>
+                        </wps:cNvSpPr>
+                        <wps:spPr bwMode="auto">
+                          <a:xfrm>
+                            <a:off x="0" y="-38"/>
+                            <a:ext cx="5550" cy="380"/>
+                          </a:xfrm>
+                          <a:custGeom>
+                            <a:avLst/>
+                            <a:gdLst>
+                              <a:gd name="T0" fmla="*/ 5360 w 5550"/>
+                              <a:gd name="T1" fmla="+- 0 -38 -38"/>
+                              <a:gd name="T2" fmla="*/ -38 h 380"/>
+                              <a:gd name="T3" fmla="*/ 0 w 5550"/>
+                              <a:gd name="T4" fmla="+- 0 -38 -38"/>
+                              <a:gd name="T5" fmla="*/ -38 h 380"/>
+                              <a:gd name="T6" fmla="*/ 0 w 5550"/>
+                              <a:gd name="T7" fmla="+- 0 342 -38"/>
+                              <a:gd name="T8" fmla="*/ 342 h 380"/>
+                              <a:gd name="T9" fmla="*/ 5360 w 5550"/>
+                              <a:gd name="T10" fmla="+- 0 342 -38"/>
+                              <a:gd name="T11" fmla="*/ 342 h 380"/>
+                              <a:gd name="T12" fmla="*/ 5550 w 5550"/>
+                              <a:gd name="T13" fmla="+- 0 152 -38"/>
+                              <a:gd name="T14" fmla="*/ 152 h 380"/>
+                              <a:gd name="T15" fmla="*/ 5360 w 5550"/>
+                              <a:gd name="T16" fmla="+- 0 -38 -38"/>
+                              <a:gd name="T17" fmla="*/ -38 h 380"/>
+                            </a:gdLst>
+                            <a:ahLst/>
+                            <a:cxnLst>
+                              <a:cxn ang="0">
+                                <a:pos x="T0" y="T2"/>
+                              </a:cxn>
+                              <a:cxn ang="0">
+                                <a:pos x="T3" y="T5"/>
+                              </a:cxn>
+                              <a:cxn ang="0">
+                                <a:pos x="T6" y="T8"/>
+                              </a:cxn>
+                              <a:cxn ang="0">
+                                <a:pos x="T9" y="T11"/>
+                              </a:cxn>
+                              <a:cxn ang="0">
+                                <a:pos x="T12" y="T14"/>
+                              </a:cxn>
+                              <a:cxn ang="0">
+                                <a:pos x="T15" y="T17"/>
+                              </a:cxn>
+                            </a:cxnLst>
+                            <a:rect l="0" t="0" r="r" b="b"/>
+                            <a:pathLst>
+                              <a:path w="5550" h="380">
+                                <a:moveTo>
+                                  <a:pt x="5360" y="0"/>
+                                </a:moveTo>
+                                <a:lnTo>
+                                  <a:pt x="0" y="0"/>
+                                </a:lnTo>
+                                <a:lnTo>
+                                  <a:pt x="0" y="380"/>
+                                </a:lnTo>
+                                <a:lnTo>
+                                  <a:pt x="5360" y="380"/>
+                                </a:lnTo>
+                                <a:lnTo>
+                                  <a:pt x="5550" y="190"/>
+                                </a:lnTo>
+                                <a:lnTo>
+                                  <a:pt x="5360" y="0"/>
+                                </a:lnTo>
+                                <a:close/>
+                              </a:path>
+                            </a:pathLst>
+                          </a:custGeom>
+                          <a:solidFill>
+                            <a:srgbClr val="005F75"/>
+                          </a:solidFill>
+                          <a:ln>
+                            <a:noFill/>
+                          </a:ln>
+                          <a:extLst>
+                            <a:ext uri="{91240B29-F687-4F45-9708-019B960494DF}">
+                              <a14:hiddenLine xmlns:a14="http://schemas.microsoft.com/office/drawing/2010/main" w="9525">
+                                <a:solidFill>
+                                  <a:srgbClr val="000000"/>
+                                </a:solidFill>
+                                <a:round/>
+                                <a:headEnd/>
+                                <a:tailEnd/>
+                              </a14:hiddenLine>
+                            </a:ext>
+                          </a:extLst>
+                        </wps:spPr>
+                        <wps:bodyPr rot="0" vert="horz" wrap="square" lIns="91440" tIns="45720" rIns="91440" bIns="45720" anchor="t" anchorCtr="0" upright="1">
+                          <a:noAutofit/>
+                        </wps:bodyPr>
+                      </wps:wsp>
+                      <wps:wsp>
+                        <wps:cNvPr id="931931672" name="docshape25"/>
+                        <wps:cNvSpPr>
+                          <a:spLocks/>
+                        </wps:cNvSpPr>
+                        <wps:spPr bwMode="auto">
+                          <a:xfrm>
+                            <a:off x="0" y="-38"/>
+                            <a:ext cx="5550" cy="380"/>
+                          </a:xfrm>
+                          <a:custGeom>
+                            <a:avLst/>
+                            <a:gdLst>
+                              <a:gd name="T0" fmla="*/ 0 w 5550"/>
+                              <a:gd name="T1" fmla="+- 0 -38 -38"/>
+                              <a:gd name="T2" fmla="*/ -38 h 380"/>
+                              <a:gd name="T3" fmla="*/ 5360 w 5550"/>
+                              <a:gd name="T4" fmla="+- 0 -38 -38"/>
+                              <a:gd name="T5" fmla="*/ -38 h 380"/>
+                              <a:gd name="T6" fmla="*/ 5550 w 5550"/>
+                              <a:gd name="T7" fmla="+- 0 152 -38"/>
+                              <a:gd name="T8" fmla="*/ 152 h 380"/>
+                              <a:gd name="T9" fmla="*/ 5360 w 5550"/>
+                              <a:gd name="T10" fmla="+- 0 342 -38"/>
+                              <a:gd name="T11" fmla="*/ 342 h 380"/>
+                              <a:gd name="T12" fmla="*/ 0 w 5550"/>
+                              <a:gd name="T13" fmla="+- 0 342 -38"/>
+                              <a:gd name="T14" fmla="*/ 342 h 380"/>
+                            </a:gdLst>
+                            <a:ahLst/>
+                            <a:cxnLst>
+                              <a:cxn ang="0">
+                                <a:pos x="T0" y="T2"/>
+                              </a:cxn>
+                              <a:cxn ang="0">
+                                <a:pos x="T3" y="T5"/>
+                              </a:cxn>
+                              <a:cxn ang="0">
+                                <a:pos x="T6" y="T8"/>
+                              </a:cxn>
+                              <a:cxn ang="0">
+                                <a:pos x="T9" y="T11"/>
+                              </a:cxn>
+                              <a:cxn ang="0">
+                                <a:pos x="T12" y="T14"/>
+                              </a:cxn>
+                            </a:cxnLst>
+                            <a:rect l="0" t="0" r="r" b="b"/>
+                            <a:pathLst>
+                              <a:path w="5550" h="380">
+                                <a:moveTo>
+                                  <a:pt x="0" y="0"/>
+                                </a:moveTo>
+                                <a:lnTo>
+                                  <a:pt x="5360" y="0"/>
+                                </a:lnTo>
+                                <a:lnTo>
+                                  <a:pt x="5550" y="190"/>
+                                </a:lnTo>
+                                <a:lnTo>
+                                  <a:pt x="5360" y="380"/>
+                                </a:lnTo>
+                                <a:lnTo>
+                                  <a:pt x="0" y="380"/>
+                                </a:lnTo>
+                              </a:path>
+                            </a:pathLst>
+                          </a:custGeom>
+                          <a:noFill/>
+                          <a:ln w="12700">
+                            <a:solidFill>
+                              <a:srgbClr val="006775"/>
+                            </a:solidFill>
+                            <a:round/>
+                            <a:headEnd/>
+                            <a:tailEnd/>
+                          </a:ln>
+                          <a:extLst>
+                            <a:ext uri="{909E8E84-426E-40DD-AFC4-6F175D3DCCD1}">
+                              <a14:hiddenFill xmlns:a14="http://schemas.microsoft.com/office/drawing/2010/main">
+                                <a:solidFill>
+                                  <a:srgbClr val="FFFFFF"/>
+                                </a:solidFill>
+                              </a14:hiddenFill>
+                            </a:ext>
+                          </a:extLst>
+                        </wps:spPr>
+                        <wps:bodyPr rot="0" vert="horz" wrap="square" lIns="91440" tIns="45720" rIns="91440" bIns="45720" anchor="t" anchorCtr="0" upright="1">
+                          <a:noAutofit/>
+                        </wps:bodyPr>
+                      </wps:wsp>
+                    </wpg:wgp>
+                  </a:graphicData>
+                </a:graphic>
+                <wp14:sizeRelH relativeFrom="page">
+                  <wp14:pctWidth>0</wp14:pctWidth>
+                </wp14:sizeRelH>
+                <wp14:sizeRelV relativeFrom="page">
+                  <wp14:pctHeight>0</wp14:pctHeight>
+                </wp14:sizeRelV>
+              </wp:anchor>
+            </w:drawing>
+          </mc:Choice>
+          <mc:Fallback>
+            <w:pict>
+              <v:group w14:anchorId="36E9431A" id="docshapegroup20" o:spid="_x0000_s1026" style="position:absolute;margin-left:-.5pt;margin-top:-4.5pt;width:612.5pt;height:27.85pt;z-index:-15720448;mso-position-horizontal-relative:page" coordorigin="-10,-90" coordsize="12250,557" o:gfxdata="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">
+                <v:shape id="docshape21" o:spid="_x0000_s1027" type="#_x0000_t75" style="position:absolute;left:3561;top:-67;width:8679;height:477;visibility:visible;mso-wrap-style:square" o:gfxdata="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">
+                  <v:imagedata r:id="rId27" o:title=""/>
+                </v:shape>
+                <v:shape id="docshape22" o:spid="_x0000_s1028" type="#_x0000_t75" style="position:absolute;left:3575;top:-38;width:8665;height:343;visibility:visible;mso-wrap-style:square" o:gfxdata="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">
+                  <v:imagedata r:id="rId28" o:title=""/>
+                </v:shape>
+                <v:shape id="docshape23" o:spid="_x0000_s1029" type="#_x0000_t75" style="position:absolute;top:-90;width:5628;height:557;visibility:visible;mso-wrap-style:square" o:gfxdata="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">
+                  <v:imagedata r:id="rId29" o:title=""/>
+                </v:shape>
+                <v:shape id="docshape24" o:spid="_x0000_s1030" style="position:absolute;top:-38;width:5550;height:380;visibility:visible;mso-wrap-style:square;v-text-anchor:top" coordsize="5550,380" o:gfxdata="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" path="m5360,l,,,380r5360,l5550,190,5360,xe" fillcolor="#005f75" stroked="f">
+                  <v:path arrowok="t" o:connecttype="custom" o:connectlocs="5360,-38;0,-38;0,342;5360,342;5550,152;5360,-38" o:connectangles="0,0,0,0,0,0"/>
+                </v:shape>
+                <v:shape id="docshape25" o:spid="_x0000_s1031" style="position:absolute;top:-38;width:5550;height:380;visibility:visible;mso-wrap-style:square;v-text-anchor:top" coordsize="5550,380" o:gfxdata="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" path="m,l5360,r190,190l5360,380,,380e" filled="f" strokecolor="#006775" strokeweight="1pt">
+                  <v:path arrowok="t" o:connecttype="custom" o:connectlocs="0,-38;5360,-38;5550,152;5360,342;0,342" o:connectangles="0,0,0,0,0"/>
+                </v:shape>
+                <w10:wrap anchorx="page"/>
+              </v:group>
+            </w:pict>
+          </mc:Fallback>
+        </mc:AlternateContent>
+      </w:r>
+      <w:r>
+        <w:rPr>
+          <w:color w:val="FFFFFF"/>
+        </w:rPr>
+        <w:t xml:space="preserve">REFERENCES</w:t>
       </w:r>
     </w:p>
     <w:p>
       <w:pPr>
-        <w:tabs>
-          <w:tab w:val="left" w:pos="845"/>
-        </w:tabs>
-        <w:spacing w:before="1"/>
-        <w:ind w:left="360"/>
-        <w:rPr>
-          <w:rFonts w:ascii="Arial" w:hAnsi="Arial" w:cs="Arial"/>
-          <w:sz w:val="20"/>
-          <w:szCs w:val="24"/>
-        </w:rPr>
-      </w:pPr>
-      <w:r>
-        <w:rPr>
-          <w:rFonts w:ascii="Arial" w:hAnsi="Arial" w:cs="Arial"/>
-          <w:sz w:val="20"/>
-          <w:szCs w:val="24"/>
-          <w:b w:val="0"/>
-          <w:bCs w:val="0"/>
-        </w:rPr>
-        <w:t xml:space="preserve">Edson Saavedra | Manager, Rosa Mexicano | (908) 307-0312</w:t>
+        <w:pStyle w:val="Heading2"/>
+        <w:ind w:left="288"/>
+        <w:rPr>
+          <w:color w:val="005F75"/>
+        </w:rPr>
+        <w:spacing w:before="80"/>
+      </w:pPr>
+      <w:r>
+        <w:rPr>
+          <w:color w:val="005F75"/>
+        </w:rPr>
+        <w:t xml:space="preserve">MOUNIR GUIRGUIS | Restaurant Owner and Mentor, Stelton Pizza | (732) 261-2829</w:t>
       </w:r>
     </w:p>
     <w:p>
       <w:pPr>
-        <w:tabs>
-          <w:tab w:val="left" w:pos="845"/>
-        </w:tabs>
-        <w:spacing w:before="1"/>
-        <w:ind w:left="360"/>
-        <w:rPr>
-          <w:rFonts w:ascii="Arial" w:hAnsi="Arial" w:cs="Arial"/>
-          <w:sz w:val="20"/>
-          <w:szCs w:val="24"/>
-        </w:rPr>
-      </w:pPr>
-      <w:r>
-        <w:rPr>
-          <w:rFonts w:ascii="Arial" w:hAnsi="Arial" w:cs="Arial"/>
-          <w:sz w:val="20"/>
-          <w:szCs w:val="24"/>
-          <w:b w:val="0"/>
-          <w:bCs w:val="0"/>
-        </w:rPr>
-        <w:t xml:space="preserve">Sophia Chigar | Assistant Manager, Madison Modern Social | (646) 385-9094</w:t>
+        <w:pStyle w:val="Heading2"/>
+        <w:ind w:left="288"/>
+        <w:rPr>
+          <w:color w:val="005F75"/>
+        </w:rPr>
+      </w:pPr>
+      <w:r>
+        <w:rPr>
+          <w:color w:val="005F75"/>
+        </w:rPr>
+        <w:t xml:space="preserve">EDSON SAAVEDRA | Manager, Rosa Mexicano | (908) 307-0312</w:t>
+      </w:r>
+    </w:p>
+    <w:p>
+      <w:pPr>
+        <w:pStyle w:val="Heading2"/>
+        <w:ind w:left="288"/>
+        <w:rPr>
+          <w:color w:val="005F75"/>
+        </w:rPr>
+      </w:pPr>
+      <w:r>
+        <w:rPr>
+          <w:color w:val="005F75"/>
+        </w:rPr>
+        <w:t xml:space="preserve">SOPHIA JANICKE | Manager, The Chop Shop | (917) 968-0572</w:t>
       </w:r>
     </w:p>
     <w:sectPr>

</xml_diff>

<commit_message>
Replace resume calibration project with NaOH standardization
</commit_message>
<xml_diff>
--- a/resume/Duy_Linh_Hoang_Resume.docx
+++ b/resume/Duy_Linh_Hoang_Resume.docx
@@ -2319,7 +2319,7 @@
         <w:rPr>
           <w:color w:val="005F75"/>
         </w:rPr>
-        <w:t xml:space="preserve">SPECTROPHOTOMETRIC CALIBRATION ~ UV-Vis | Excel</w:t>
+        <w:t xml:space="preserve">STANDARDIZING NaOH AND ANALYZING AN UNKNOWN ACID ~ Titration | Excel</w:t>
       </w:r>
     </w:p>
     <w:p>
@@ -2344,7 +2344,7 @@
           <w:bCs w:val="0"/>
           <w:color w:val="000000" w:themeColor="text1"/>
         </w:rPr>
-        <w:t xml:space="preserve">Prepared standards and measured blank, sample, and replicate absorbance at 420 nm. Used Excel regression to compare external calibration and standard addition for concentration estimates; produced a report and workbook examining uncertainty, detection limits, differing results, and possible matrix effects.</w:t>
+        <w:t xml:space="preserve">Standardized NaOH against potassium hydrogen phthalate with replicate titrations and measured pH while titrating an unknown acid. Used blank corrections and Excel calculations to establish titrant concentration for quantitative analysis; produced a report and workbook documenting results, the pH curve, and unknown-acid calculations.</w:t>
       </w:r>
     </w:p>
     <w:p>

</xml_diff>

<commit_message>
Add bullets to resume references
</commit_message>
<xml_diff>
--- a/resume/Duy_Linh_Hoang_Resume.docx
+++ b/resume/Duy_Linh_Hoang_Resume.docx
@@ -3357,8 +3357,12 @@
     </w:p>
     <w:p>
       <w:pPr>
+        <w:numPr>
+          <w:ilvl w:val="0"/>
+          <w:numId w:val="1"/>
+        </w:numPr>
         <w:pStyle w:val="Heading2"/>
-        <w:ind w:left="288"/>
+        <w:ind w:left="720" w:hanging="360"/>
         <w:rPr>
           <w:color w:val="005F75"/>
         </w:rPr>
@@ -3373,8 +3377,12 @@
     </w:p>
     <w:p>
       <w:pPr>
+        <w:numPr>
+          <w:ilvl w:val="0"/>
+          <w:numId w:val="1"/>
+        </w:numPr>
         <w:pStyle w:val="Heading2"/>
-        <w:ind w:left="288"/>
+        <w:ind w:left="720" w:hanging="360"/>
         <w:rPr>
           <w:color w:val="005F75"/>
         </w:rPr>
@@ -3388,8 +3396,12 @@
     </w:p>
     <w:p>
       <w:pPr>
+        <w:numPr>
+          <w:ilvl w:val="0"/>
+          <w:numId w:val="1"/>
+        </w:numPr>
         <w:pStyle w:val="Heading2"/>
-        <w:ind w:left="288"/>
+        <w:ind w:left="720" w:hanging="360"/>
         <w:rPr>
           <w:color w:val="005F75"/>
         </w:rPr>

</xml_diff>

<commit_message>
Make resume reference bullets black
</commit_message>
<xml_diff>
--- a/resume/Duy_Linh_Hoang_Resume.docx
+++ b/resume/Duy_Linh_Hoang_Resume.docx
@@ -3357,14 +3357,14 @@
     </w:p>
     <w:p>
       <w:pPr>
+        <w:pStyle w:val="Heading2"/>
         <w:numPr>
           <w:ilvl w:val="0"/>
           <w:numId w:val="1"/>
         </w:numPr>
-        <w:pStyle w:val="Heading2"/>
         <w:ind w:left="720" w:hanging="360"/>
         <w:rPr>
-          <w:color w:val="005F75"/>
+          <w:color w:val="000000"/>
         </w:rPr>
         <w:spacing w:before="80"/>
       </w:pPr>
@@ -3377,14 +3377,14 @@
     </w:p>
     <w:p>
       <w:pPr>
+        <w:pStyle w:val="Heading2"/>
         <w:numPr>
           <w:ilvl w:val="0"/>
           <w:numId w:val="1"/>
         </w:numPr>
-        <w:pStyle w:val="Heading2"/>
         <w:ind w:left="720" w:hanging="360"/>
         <w:rPr>
-          <w:color w:val="005F75"/>
+          <w:color w:val="000000"/>
         </w:rPr>
       </w:pPr>
       <w:r>
@@ -3396,14 +3396,14 @@
     </w:p>
     <w:p>
       <w:pPr>
+        <w:pStyle w:val="Heading2"/>
         <w:numPr>
           <w:ilvl w:val="0"/>
           <w:numId w:val="1"/>
         </w:numPr>
-        <w:pStyle w:val="Heading2"/>
         <w:ind w:left="720" w:hanging="360"/>
         <w:rPr>
-          <w:color w:val="005F75"/>
+          <w:color w:val="000000"/>
         </w:rPr>
       </w:pPr>
       <w:r>

</xml_diff>

<commit_message>
Update resume work history and add website contact link
</commit_message>
<xml_diff>
--- a/resume/Duy_Linh_Hoang_Resume.docx
+++ b/resume/Duy_Linh_Hoang_Resume.docx
@@ -593,16 +593,18 @@
                                   <w:sz w:val="18"/>
                                 </w:rPr>
                               </w:pPr>
-                              <w:r>
-                                <w:rPr>
-                                  <w:rFonts w:ascii="Calibri"/>
-                                  <w:spacing w:val="-2"/>
-                                  <w:sz w:val="18"/>
-                                  <w:b w:val="0"/>
-                                  <w:bCs w:val="0"/>
-                                </w:rPr>
-                                <w:t xml:space="preserve"/>
-                              </w:r>
+                              <w:hyperlink r:id="rIdDuyWebsite">
+                                <w:r>
+                                  <w:rPr>
+                                    <w:rFonts w:ascii="Calibri"/>
+                                    <w:spacing w:val="-2"/>
+                                    <w:sz w:val="18"/>
+                                    <w:b w:val="0"/>
+                                    <w:bCs w:val="0"/>
+                                  </w:rPr>
+                                  <w:t xml:space="preserve">My Website</w:t>
+                                </w:r>
+                              </w:hyperlink>
                             </w:p>
                           </w:txbxContent>
                         </wps:txbx>
@@ -820,16 +822,18 @@
                             <w:sz w:val="18"/>
                           </w:rPr>
                         </w:pPr>
-                        <w:r>
-                          <w:rPr>
-                            <w:rFonts w:ascii="Calibri"/>
-                            <w:spacing w:val="-2"/>
-                            <w:sz w:val="18"/>
-                            <w:b w:val="0"/>
-                            <w:bCs w:val="0"/>
-                          </w:rPr>
-                          <w:t xml:space="preserve"/>
-                        </w:r>
+                        <w:hyperlink r:id="rIdDuyWebsite">
+                          <w:r>
+                            <w:rPr>
+                              <w:rFonts w:ascii="Calibri"/>
+                              <w:spacing w:val="-2"/>
+                              <w:sz w:val="18"/>
+                              <w:b w:val="0"/>
+                              <w:bCs w:val="0"/>
+                            </w:rPr>
+                            <w:t xml:space="preserve">My Website</w:t>
+                          </w:r>
+                        </w:hyperlink>
                       </w:p>
                     </w:txbxContent>
                   </v:textbox>
@@ -2818,7 +2822,7 @@
         <w:rPr>
           <w:color w:val="005F75"/>
         </w:rPr>
-        <w:t xml:space="preserve">MEXIMODO | Jersey City and Metuchen, NJ ~ Head Server | October 2023–May 2026</w:t>
+        <w:t xml:space="preserve">MEXIMODO | Jersey City and Metuchen, NJ ~ Floor Manager and Head Server | October 2023–May 2026</w:t>
       </w:r>
     </w:p>
     <w:p>
@@ -2844,46 +2848,6 @@
           <w:color w:val="000000" w:themeColor="text1"/>
         </w:rPr>
         <w:t xml:space="preserve">Trained servers on service, allergy protocols, and menu knowledge; assessed new hires’ readiness and used Toast POS to support consistent service and accurate transactions.</w:t>
-      </w:r>
-    </w:p>
-    <w:p>
-      <w:pPr>
-        <w:pStyle w:val="Heading2"/>
-        <w:ind w:left="288"/>
-        <w:rPr>
-          <w:color w:val="005F75"/>
-        </w:rPr>
-      </w:pPr>
-      <w:r>
-        <w:rPr>
-          <w:color w:val="005F75"/>
-        </w:rPr>
-        <w:t xml:space="preserve">MADISON MODERN SOCIAL | Old Bridge, NJ ~ Server | February 2025–August 2025</w:t>
-      </w:r>
-    </w:p>
-    <w:p>
-      <w:pPr>
-        <w:pStyle w:val="Heading2"/>
-        <w:numPr>
-          <w:ilvl w:val="0"/>
-          <w:numId w:val="1"/>
-        </w:numPr>
-        <w:ind w:right="288"/>
-        <w:rPr>
-          <w:rFonts w:ascii="Arial" w:hAnsi="Arial" w:cs="Arial"/>
-          <w:b w:val="0"/>
-          <w:bCs w:val="0"/>
-          <w:color w:val="000000" w:themeColor="text1"/>
-        </w:rPr>
-      </w:pPr>
-      <w:r>
-        <w:rPr>
-          <w:rFonts w:ascii="Arial" w:hAnsi="Arial" w:cs="Arial"/>
-          <w:b w:val="0"/>
-          <w:bCs w:val="0"/>
-          <w:color w:val="000000" w:themeColor="text1"/>
-        </w:rPr>
-        <w:t xml:space="preserve">Supported the grand opening through staff training, menu rollouts, and launch-event service, helping the team prepare for high-volume operations and changing priorities.</w:t>
       </w:r>
     </w:p>
     <w:p>

</xml_diff>

<commit_message>
Revise resume experience and remove buffer overflow entry
</commit_message>
<xml_diff>
--- a/resume/Duy_Linh_Hoang_Resume.docx
+++ b/resume/Duy_Linh_Hoang_Resume.docx
@@ -2203,46 +2203,6 @@
         <w:rPr>
           <w:color w:val="005F75"/>
         </w:rPr>
-        <w:t xml:space="preserve">STUDYING BUFFER OVERFLOW ~ Stack Memory | ASLR | Exploit Analysis</w:t>
-      </w:r>
-    </w:p>
-    <w:p>
-      <w:pPr>
-        <w:pStyle w:val="Heading2"/>
-        <w:numPr>
-          <w:ilvl w:val="0"/>
-          <w:numId w:val="2"/>
-        </w:numPr>
-        <w:rPr>
-          <w:rFonts w:ascii="Arial" w:hAnsi="Arial" w:cs="Arial"/>
-          <w:b w:val="0"/>
-          <w:bCs w:val="0"/>
-          <w:color w:val="000000" w:themeColor="text1"/>
-        </w:rPr>
-        <w:ind w:right="562"/>
-      </w:pPr>
-      <w:r>
-        <w:rPr>
-          <w:rFonts w:ascii="Arial" w:hAnsi="Arial" w:cs="Arial"/>
-          <w:b w:val="0"/>
-          <w:bCs w:val="0"/>
-          <w:color w:val="000000" w:themeColor="text1"/>
-        </w:rPr>
-        <w:t xml:space="preserve">Analyzed stack layouts, unsafe memory copying, ASLR, and memory protections during a controlled exploit exercise. Connected overflow behavior to stack contents to explain vulnerability mechanisms; produced a lab report and exploit source documenting parameters and observed behavior.</w:t>
-      </w:r>
-    </w:p>
-    <w:p>
-      <w:pPr>
-        <w:pStyle w:val="Heading2"/>
-        <w:ind w:left="288" w:right="562"/>
-        <w:rPr>
-          <w:color w:val="005F75"/>
-        </w:rPr>
-      </w:pPr>
-      <w:r>
-        <w:rPr>
-          <w:color w:val="005F75"/>
-        </w:rPr>
         <w:t xml:space="preserve">EXPLORING PACKET SPOOFING AND FIREWALLS ~ Docker | Scapy | iptables</w:t>
       </w:r>
     </w:p>
@@ -2807,7 +2767,7 @@
           <w:bCs w:val="0"/>
           <w:color w:val="000000" w:themeColor="text1"/>
         </w:rPr>
-        <w:t xml:space="preserve">Explain menu choices, preparation options, and beverage pairings so guests can make informed selections; provide attentive service throughout their visit.</w:t>
+        <w:t xml:space="preserve">Built guest relationships from the first interaction and provided a welcoming, personalized dining experience to support customer satisfaction and loyalty.</w:t>
       </w:r>
     </w:p>
     <w:p>
@@ -2847,22 +2807,7 @@
           <w:bCs w:val="0"/>
           <w:color w:val="000000" w:themeColor="text1"/>
         </w:rPr>
-        <w:t xml:space="preserve">Trained servers on service, allergy protocols, and menu knowledge; assessed new hires’ readiness and used Toast POS to support consistent service and accurate transactions.</w:t>
-      </w:r>
-    </w:p>
-    <w:p>
-      <w:pPr>
-        <w:pStyle w:val="Heading2"/>
-        <w:ind w:left="288"/>
-        <w:rPr>
-          <w:color w:val="005F75"/>
-        </w:rPr>
-      </w:pPr>
-      <w:r>
-        <w:rPr>
-          <w:color w:val="005F75"/>
-        </w:rPr>
-        <w:t xml:space="preserve">RED ROBIN | Woodbridge, NJ ~ Associate Manager and Server | November 2020–April 2023</w:t>
+        <w:t xml:space="preserve">Responded to diverse guest needs in a fast-paced environment, strengthening adaptability and problem-solving skills.</w:t>
       </w:r>
     </w:p>
     <w:p>
@@ -2887,7 +2832,7 @@
           <w:bCs w:val="0"/>
           <w:color w:val="000000" w:themeColor="text1"/>
         </w:rPr>
-        <w:t xml:space="preserve">Reviewed sales trends and labor costs to inform staffing and operating decisions; reconciled cash and deposits and flagged discrepancies for management review.</w:t>
+        <w:t xml:space="preserve">Scheduled servers and bartenders based on strengths, development needs, and team dynamics to improve staffing and service.</w:t>
       </w:r>
     </w:p>
     <w:p>
@@ -2912,7 +2857,147 @@
           <w:bCs w:val="0"/>
           <w:color w:val="000000" w:themeColor="text1"/>
         </w:rPr>
-        <w:t xml:space="preserve">Reviewed comps, voids, discounts, and refunds to identify transaction patterns and support revenue controls.</w:t>
+        <w:t xml:space="preserve">Designed and implemented floor plans to improve operational efficiency, workflow, and the guest experience.</w:t>
+      </w:r>
+    </w:p>
+    <w:p>
+      <w:pPr>
+        <w:pStyle w:val="Heading2"/>
+        <w:numPr>
+          <w:ilvl w:val="0"/>
+          <w:numId w:val="1"/>
+        </w:numPr>
+        <w:ind w:right="288"/>
+        <w:rPr>
+          <w:rFonts w:ascii="Arial" w:hAnsi="Arial" w:cs="Arial"/>
+          <w:b w:val="0"/>
+          <w:bCs w:val="0"/>
+          <w:color w:val="000000" w:themeColor="text1"/>
+        </w:rPr>
+      </w:pPr>
+      <w:r>
+        <w:rPr>
+          <w:rFonts w:ascii="Arial" w:hAnsi="Arial" w:cs="Arial"/>
+          <w:b w:val="0"/>
+          <w:bCs w:val="0"/>
+          <w:color w:val="000000" w:themeColor="text1"/>
+        </w:rPr>
+        <w:t xml:space="preserve">Coordinated front-of-house operations and team communication, strengthening leadership and organizational skills.</w:t>
+      </w:r>
+    </w:p>
+    <w:p>
+      <w:pPr>
+        <w:pStyle w:val="Heading2"/>
+        <w:ind w:left="288"/>
+        <w:rPr>
+          <w:color w:val="005F75"/>
+        </w:rPr>
+      </w:pPr>
+      <w:r>
+        <w:rPr>
+          <w:color w:val="005F75"/>
+        </w:rPr>
+        <w:t xml:space="preserve">RED ROBIN | Woodbridge, NJ ~ Associate Manager and Server | November 2020–April 2023</w:t>
+      </w:r>
+    </w:p>
+    <w:p>
+      <w:pPr>
+        <w:pStyle w:val="Heading2"/>
+        <w:numPr>
+          <w:ilvl w:val="0"/>
+          <w:numId w:val="1"/>
+        </w:numPr>
+        <w:ind w:right="288"/>
+        <w:rPr>
+          <w:rFonts w:ascii="Arial" w:hAnsi="Arial" w:cs="Arial"/>
+          <w:b w:val="0"/>
+          <w:bCs w:val="0"/>
+          <w:color w:val="000000" w:themeColor="text1"/>
+        </w:rPr>
+      </w:pPr>
+      <w:r>
+        <w:rPr>
+          <w:rFonts w:ascii="Arial" w:hAnsi="Arial" w:cs="Arial"/>
+          <w:b w:val="0"/>
+          <w:bCs w:val="0"/>
+          <w:color w:val="000000" w:themeColor="text1"/>
+        </w:rPr>
+        <w:t xml:space="preserve">Studied Profit &amp; Loss (P&amp;L) management, including food, liquor, and labor costs and their impact on restaurant profitability.</w:t>
+      </w:r>
+    </w:p>
+    <w:p>
+      <w:pPr>
+        <w:pStyle w:val="Heading2"/>
+        <w:numPr>
+          <w:ilvl w:val="0"/>
+          <w:numId w:val="1"/>
+        </w:numPr>
+        <w:ind w:right="288"/>
+        <w:rPr>
+          <w:rFonts w:ascii="Arial" w:hAnsi="Arial" w:cs="Arial"/>
+          <w:b w:val="0"/>
+          <w:bCs w:val="0"/>
+          <w:color w:val="000000" w:themeColor="text1"/>
+        </w:rPr>
+      </w:pPr>
+      <w:r>
+        <w:rPr>
+          <w:rFonts w:ascii="Arial" w:hAnsi="Arial" w:cs="Arial"/>
+          <w:b w:val="0"/>
+          <w:bCs w:val="0"/>
+          <w:color w:val="000000" w:themeColor="text1"/>
+        </w:rPr>
+        <w:t xml:space="preserve">Evaluated how operational costs, staffing, and resource allocation affect financial performance.</w:t>
+      </w:r>
+    </w:p>
+    <w:p>
+      <w:pPr>
+        <w:pStyle w:val="Heading2"/>
+        <w:numPr>
+          <w:ilvl w:val="0"/>
+          <w:numId w:val="1"/>
+        </w:numPr>
+        <w:ind w:right="288"/>
+        <w:rPr>
+          <w:rFonts w:ascii="Arial" w:hAnsi="Arial" w:cs="Arial"/>
+          <w:b w:val="0"/>
+          <w:bCs w:val="0"/>
+          <w:color w:val="000000" w:themeColor="text1"/>
+        </w:rPr>
+      </w:pPr>
+      <w:r>
+        <w:rPr>
+          <w:rFonts w:ascii="Arial" w:hAnsi="Arial" w:cs="Arial"/>
+          <w:b w:val="0"/>
+          <w:bCs w:val="0"/>
+          <w:color w:val="000000" w:themeColor="text1"/>
+        </w:rPr>
+        <w:t xml:space="preserve">Coordinated Front of House and Back of House communication among servers, bartenders, hosts, and kitchen staff to support daily operations.</w:t>
+      </w:r>
+    </w:p>
+    <w:p>
+      <w:pPr>
+        <w:pStyle w:val="Heading2"/>
+        <w:numPr>
+          <w:ilvl w:val="0"/>
+          <w:numId w:val="1"/>
+        </w:numPr>
+        <w:ind w:right="288"/>
+        <w:rPr>
+          <w:rFonts w:ascii="Arial" w:hAnsi="Arial" w:cs="Arial"/>
+          <w:b w:val="0"/>
+          <w:bCs w:val="0"/>
+          <w:color w:val="000000" w:themeColor="text1"/>
+        </w:rPr>
+      </w:pPr>
+      <w:r>
+        <w:rPr>
+          <w:rFonts w:ascii="Arial" w:hAnsi="Arial" w:cs="Arial"/>
+          <w:b w:val="0"/>
+          <w:bCs w:val="0"/>
+          <w:color w:val="000000" w:themeColor="text1"/>
+        </w:rPr>
+        <w:t xml:space="preserve">Reviewed sales trends, cash deposits, discounts, voids, and refunds to support financial accuracy and accountability.</w:t>
       </w:r>
     </w:p>
     <w:p>

</xml_diff>

<commit_message>
Restore buffer overflow project to one-page resume
</commit_message>
<xml_diff>
--- a/resume/Duy_Linh_Hoang_Resume.docx
+++ b/resume/Duy_Linh_Hoang_Resume.docx
@@ -2203,6 +2203,46 @@
         <w:rPr>
           <w:color w:val="005F75"/>
         </w:rPr>
+        <w:t xml:space="preserve">STUDYING BUFFER OVERFLOW ~ Stack Memory | ASLR | Exploit Analysis</w:t>
+      </w:r>
+    </w:p>
+    <w:p>
+      <w:pPr>
+        <w:pStyle w:val="Heading2"/>
+        <w:numPr>
+          <w:ilvl w:val="0"/>
+          <w:numId w:val="2"/>
+        </w:numPr>
+        <w:rPr>
+          <w:rFonts w:ascii="Arial" w:hAnsi="Arial" w:cs="Arial"/>
+          <w:b w:val="0"/>
+          <w:bCs w:val="0"/>
+          <w:color w:val="000000" w:themeColor="text1"/>
+        </w:rPr>
+        <w:ind w:right="562"/>
+      </w:pPr>
+      <w:r>
+        <w:rPr>
+          <w:rFonts w:ascii="Arial" w:hAnsi="Arial" w:cs="Arial"/>
+          <w:b w:val="0"/>
+          <w:bCs w:val="0"/>
+          <w:color w:val="000000" w:themeColor="text1"/>
+        </w:rPr>
+        <w:t xml:space="preserve">Analyzed stack memory, unsafe copying, ASLR, and memory protections in a controlled exploit exercise to explain overflow mechanisms. Produced a report and exploit source documenting parameters and observed behavior.</w:t>
+      </w:r>
+    </w:p>
+    <w:p>
+      <w:pPr>
+        <w:pStyle w:val="Heading2"/>
+        <w:ind w:left="288" w:right="562"/>
+        <w:rPr>
+          <w:color w:val="005F75"/>
+        </w:rPr>
+      </w:pPr>
+      <w:r>
+        <w:rPr>
+          <w:color w:val="005F75"/>
+        </w:rPr>
         <w:t xml:space="preserve">EXPLORING PACKET SPOOFING AND FIREWALLS ~ Docker | Scapy | iptables</w:t>
       </w:r>
     </w:p>
@@ -2832,7 +2872,7 @@
           <w:bCs w:val="0"/>
           <w:color w:val="000000" w:themeColor="text1"/>
         </w:rPr>
-        <w:t xml:space="preserve">Scheduled servers and bartenders based on strengths, development needs, and team dynamics to improve staffing and service.</w:t>
+        <w:t xml:space="preserve">Scheduled servers and bartenders by strengths, development needs, and team dynamics to improve staffing and service.</w:t>
       </w:r>
     </w:p>
     <w:p>
@@ -2972,7 +3012,7 @@
           <w:bCs w:val="0"/>
           <w:color w:val="000000" w:themeColor="text1"/>
         </w:rPr>
-        <w:t xml:space="preserve">Coordinated Front of House and Back of House communication among servers, bartenders, hosts, and kitchen staff to support daily operations.</w:t>
+        <w:t xml:space="preserve">Coordinated FOH and BOH communication among servers, bartenders, hosts, and kitchen staff to support daily operations.</w:t>
       </w:r>
     </w:p>
     <w:p>

</xml_diff>